<commit_message>
Build fixes and feature optimizations - Ready for production deployment
</commit_message>
<xml_diff>
--- a/public/templates/dmi_admission_template.docx
+++ b/public/templates/dmi_admission_template.docx
@@ -76,14 +76,12 @@
           <w:sz w:val="22"/>
         </w:rPr>
       </w:pPr>
-      <w:proofErr w:type="spellStart"/>
       <w:r>
         <w:rPr>
           <w:sz w:val="22"/>
         </w:rPr>
         <w:t>Ref.No</w:t>
       </w:r>
-      <w:proofErr w:type="spellEnd"/>
       <w:r>
         <w:rPr>
           <w:b/>
@@ -97,47 +95,13 @@
           <w:b/>
           <w:sz w:val="22"/>
         </w:rPr>
-        <w:t>{</w:t>
-      </w:r>
-      <w:proofErr w:type="spellStart"/>
-      <w:r>
-        <w:rPr>
-          <w:rFonts w:eastAsia="Roboto Mono"/>
-          <w:b/>
-          <w:sz w:val="22"/>
-        </w:rPr>
-        <w:t>ref_</w:t>
-      </w:r>
-      <w:proofErr w:type="gramStart"/>
-      <w:r>
-        <w:rPr>
-          <w:rFonts w:eastAsia="Roboto Mono"/>
-          <w:b/>
-          <w:sz w:val="22"/>
-        </w:rPr>
-        <w:t>no</w:t>
-      </w:r>
-      <w:proofErr w:type="spellEnd"/>
-      <w:r>
-        <w:rPr>
-          <w:rFonts w:eastAsia="Roboto Mono"/>
-          <w:b/>
-          <w:sz w:val="22"/>
-        </w:rPr>
-        <w:t>}</w:t>
-      </w:r>
-      <w:r>
-        <w:rPr>
-          <w:sz w:val="22"/>
-        </w:rPr>
-        <w:t xml:space="preserve">   </w:t>
-      </w:r>
-      <w:proofErr w:type="gramEnd"/>
-      <w:r>
-        <w:rPr>
-          <w:sz w:val="22"/>
-        </w:rPr>
-        <w:t xml:space="preserve"> </w:t>
+        <w:t>{ref_no}</w:t>
+      </w:r>
+      <w:r>
+        <w:rPr>
+          <w:sz w:val="22"/>
+        </w:rPr>
+        <w:t xml:space="preserve">    </w:t>
       </w:r>
       <w:r>
         <w:rPr>
@@ -182,48 +146,55 @@
     </w:p>
     <w:p>
       <w:pPr>
-        <w:pBdr>
-          <w:top w:val="nil"/>
-          <w:left w:val="nil"/>
-          <w:bottom w:val="nil"/>
-          <w:right w:val="nil"/>
-          <w:between w:val="nil"/>
-        </w:pBdr>
-        <w:tabs>
-          <w:tab w:val="left" w:pos="0"/>
-        </w:tabs>
-        <w:spacing w:after="120"/>
-        <w:rPr>
-          <w:sz w:val="28"/>
-        </w:rPr>
-      </w:pPr>
-    </w:p>
-    <w:p>
-      <w:pPr>
-        <w:pBdr>
-          <w:top w:val="nil"/>
-          <w:left w:val="nil"/>
-          <w:bottom w:val="nil"/>
-          <w:right w:val="nil"/>
-          <w:between w:val="nil"/>
-        </w:pBdr>
-        <w:spacing w:after="120"/>
+        <w:pStyle w:val="BodyText"/>
+        <w:spacing w:after="0"/>
         <w:jc w:val="center"/>
         <w:rPr>
           <w:b/>
-          <w:bCs/>
-          <w:sz w:val="28"/>
+          <w:sz w:val="22"/>
+          <w:szCs w:val="22"/>
           <w:u w:val="single"/>
         </w:rPr>
       </w:pPr>
-      <w:r>
-        <w:rPr>
-          <w:b/>
-          <w:bCs/>
-          <w:sz w:val="28"/>
+    </w:p>
+    <w:p>
+      <w:pPr>
+        <w:pStyle w:val="BodyText"/>
+        <w:spacing w:after="0"/>
+        <w:jc w:val="center"/>
+        <w:rPr>
+          <w:b/>
+          <w:sz w:val="22"/>
+          <w:szCs w:val="22"/>
           <w:u w:val="single"/>
         </w:rPr>
-        <w:t xml:space="preserve">CERTIFICATE OF ADMISSION </w:t>
+      </w:pPr>
+      <w:r>
+        <w:rPr>
+          <w:b/>
+          <w:sz w:val="22"/>
+          <w:szCs w:val="22"/>
+          <w:u w:val="single"/>
+        </w:rPr>
+        <w:t xml:space="preserve">CERTIFICATE OF </w:t>
+      </w:r>
+      <w:r>
+        <w:rPr>
+          <w:b/>
+          <w:sz w:val="22"/>
+          <w:szCs w:val="22"/>
+          <w:u w:val="single"/>
+        </w:rPr>
+        <w:t>ADMISSION</w:t>
+      </w:r>
+      <w:r>
+        <w:rPr>
+          <w:b/>
+          <w:sz w:val="22"/>
+          <w:szCs w:val="22"/>
+          <w:u w:val="single"/>
+        </w:rPr>
+        <w:t xml:space="preserve"> - JUNE, 2026</w:t>
       </w:r>
     </w:p>
     <w:p>
@@ -269,20 +240,7 @@
         <w:rPr>
           <w:sz w:val="22"/>
         </w:rPr>
-        <w:t>Name</w:t>
-      </w:r>
-      <w:r>
-        <w:rPr>
-          <w:sz w:val="22"/>
-        </w:rPr>
-        <w:t xml:space="preserve">:            </w:t>
-      </w:r>
-      <w:proofErr w:type="gramStart"/>
-      <w:r>
-        <w:rPr>
-          <w:sz w:val="22"/>
-        </w:rPr>
-        <w:t xml:space="preserve">   </w:t>
+        <w:t xml:space="preserve">Name:               </w:t>
       </w:r>
       <w:r>
         <w:rPr>
@@ -290,38 +248,13 @@
           <w:b/>
           <w:sz w:val="22"/>
         </w:rPr>
-        <w:t>{</w:t>
-      </w:r>
-      <w:proofErr w:type="spellStart"/>
-      <w:proofErr w:type="gramEnd"/>
-      <w:r>
-        <w:rPr>
-          <w:rFonts w:eastAsia="Roboto Mono"/>
-          <w:b/>
-          <w:sz w:val="22"/>
-        </w:rPr>
-        <w:t>student_name</w:t>
-      </w:r>
-      <w:proofErr w:type="spellEnd"/>
-      <w:r>
-        <w:rPr>
-          <w:rFonts w:eastAsia="Roboto Mono"/>
-          <w:b/>
-          <w:sz w:val="22"/>
-        </w:rPr>
-        <w:t>}</w:t>
-      </w:r>
-      <w:r>
-        <w:rPr>
-          <w:sz w:val="22"/>
-        </w:rPr>
-        <w:t xml:space="preserve"> </w:t>
-      </w:r>
-      <w:r>
-        <w:rPr>
-          <w:sz w:val="22"/>
-        </w:rPr>
-        <w:t xml:space="preserve"> </w:t>
+        <w:t>{student_name}</w:t>
+      </w:r>
+      <w:r>
+        <w:rPr>
+          <w:sz w:val="22"/>
+        </w:rPr>
+        <w:t xml:space="preserve">  </w:t>
       </w:r>
     </w:p>
     <w:p>
@@ -347,38 +280,14 @@
         <w:rPr>
           <w:sz w:val="22"/>
         </w:rPr>
-        <w:t xml:space="preserve">Mobile No:    </w:t>
-      </w:r>
-      <w:proofErr w:type="gramStart"/>
-      <w:r>
-        <w:rPr>
-          <w:sz w:val="22"/>
-        </w:rPr>
-        <w:t xml:space="preserve">   </w:t>
-      </w:r>
-      <w:r>
-        <w:rPr>
-          <w:b/>
-          <w:sz w:val="22"/>
-        </w:rPr>
-        <w:t>{</w:t>
-      </w:r>
-      <w:proofErr w:type="spellStart"/>
-      <w:proofErr w:type="gramEnd"/>
-      <w:r>
-        <w:rPr>
-          <w:b/>
-          <w:sz w:val="22"/>
-        </w:rPr>
-        <w:t>student_phone</w:t>
-      </w:r>
-      <w:proofErr w:type="spellEnd"/>
-      <w:r>
-        <w:rPr>
-          <w:b/>
-          <w:sz w:val="22"/>
-        </w:rPr>
-        <w:t>}</w:t>
+        <w:t xml:space="preserve">Mobile No:       </w:t>
+      </w:r>
+      <w:r>
+        <w:rPr>
+          <w:b/>
+          <w:sz w:val="22"/>
+        </w:rPr>
+        <w:t>{student_phone}</w:t>
       </w:r>
     </w:p>
     <w:p>
@@ -412,40 +321,14 @@
           <w:bCs/>
           <w:sz w:val="22"/>
         </w:rPr>
-        <w:t xml:space="preserve">:   </w:t>
-      </w:r>
-      <w:proofErr w:type="gramStart"/>
-      <w:r>
-        <w:rPr>
-          <w:b/>
-          <w:bCs/>
-          <w:sz w:val="22"/>
-        </w:rPr>
-        <w:t xml:space="preserve">   </w:t>
-      </w:r>
-      <w:r>
-        <w:rPr>
-          <w:b/>
-          <w:sz w:val="22"/>
-        </w:rPr>
-        <w:t>{</w:t>
-      </w:r>
-      <w:proofErr w:type="spellStart"/>
-      <w:proofErr w:type="gramEnd"/>
-      <w:r>
-        <w:rPr>
-          <w:b/>
-          <w:sz w:val="22"/>
-        </w:rPr>
-        <w:t>national_id</w:t>
-      </w:r>
-      <w:proofErr w:type="spellEnd"/>
-      <w:r>
-        <w:rPr>
-          <w:b/>
-          <w:sz w:val="22"/>
-        </w:rPr>
-        <w:t>}</w:t>
+        <w:t xml:space="preserve">:      </w:t>
+      </w:r>
+      <w:r>
+        <w:rPr>
+          <w:b/>
+          <w:sz w:val="22"/>
+        </w:rPr>
+        <w:t>{national_id}</w:t>
       </w:r>
     </w:p>
     <w:p>
@@ -486,23 +369,7 @@
           <w:b/>
           <w:sz w:val="22"/>
         </w:rPr>
-        <w:t>{</w:t>
-      </w:r>
-      <w:proofErr w:type="spellStart"/>
-      <w:r>
-        <w:rPr>
-          <w:b/>
-          <w:sz w:val="22"/>
-        </w:rPr>
-        <w:t>student_email</w:t>
-      </w:r>
-      <w:proofErr w:type="spellEnd"/>
-      <w:r>
-        <w:rPr>
-          <w:b/>
-          <w:sz w:val="22"/>
-        </w:rPr>
-        <w:t>}</w:t>
+        <w:t>{student_email}</w:t>
       </w:r>
       <w:r>
         <w:rPr>
@@ -510,8 +377,6 @@
         </w:rPr>
         <w:t xml:space="preserve"> </w:t>
       </w:r>
-      <w:bookmarkStart w:id="0" w:name="_GoBack"/>
-      <w:bookmarkEnd w:id="0"/>
       <w:r>
         <w:rPr>
           <w:sz w:val="22"/>
@@ -565,13 +430,7 @@
         <w:rPr>
           <w:sz w:val="22"/>
         </w:rPr>
-        <w:t>Type of Admission:</w:t>
-      </w:r>
-      <w:r>
-        <w:rPr>
-          <w:sz w:val="22"/>
-        </w:rPr>
-        <w:t xml:space="preserve"> </w:t>
+        <w:t xml:space="preserve">Type of Admission: </w:t>
       </w:r>
       <w:r>
         <w:rPr>
@@ -579,25 +438,7 @@
           <w:b/>
           <w:sz w:val="22"/>
         </w:rPr>
-        <w:t>{</w:t>
-      </w:r>
-      <w:proofErr w:type="spellStart"/>
-      <w:r>
-        <w:rPr>
-          <w:rFonts w:eastAsia="Roboto Mono"/>
-          <w:b/>
-          <w:sz w:val="22"/>
-        </w:rPr>
-        <w:t>mode_of_study</w:t>
-      </w:r>
-      <w:proofErr w:type="spellEnd"/>
-      <w:r>
-        <w:rPr>
-          <w:rFonts w:eastAsia="Roboto Mono"/>
-          <w:b/>
-          <w:sz w:val="22"/>
-        </w:rPr>
-        <w:t>}</w:t>
+        <w:t>{mode_of_study}</w:t>
       </w:r>
       <w:r>
         <w:rPr>
@@ -611,18 +452,7 @@
           <w:sz w:val="22"/>
         </w:rPr>
         <w:br/>
-      </w:r>
-      <w:r>
-        <w:rPr>
-          <w:sz w:val="22"/>
-        </w:rPr>
-        <w:t>Campus of Study:</w:t>
-      </w:r>
-      <w:r>
-        <w:rPr>
-          <w:sz w:val="22"/>
-        </w:rPr>
-        <w:t xml:space="preserve"> </w:t>
+        <w:t xml:space="preserve">Campus of Study: </w:t>
       </w:r>
       <w:r>
         <w:rPr>
@@ -649,36 +479,14 @@
         <w:rPr>
           <w:sz w:val="22"/>
         </w:rPr>
-        <w:t>Reference Person</w:t>
-      </w:r>
-      <w:r>
-        <w:rPr>
-          <w:sz w:val="22"/>
-        </w:rPr>
-        <w:t xml:space="preserve">: </w:t>
-      </w:r>
-      <w:r>
-        <w:rPr>
-          <w:b/>
-          <w:sz w:val="22"/>
-        </w:rPr>
-        <w:t>{</w:t>
-      </w:r>
-      <w:proofErr w:type="spellStart"/>
-      <w:r>
-        <w:rPr>
-          <w:b/>
-          <w:sz w:val="22"/>
-        </w:rPr>
-        <w:t>reference_person</w:t>
-      </w:r>
-      <w:proofErr w:type="spellEnd"/>
-      <w:r>
-        <w:rPr>
-          <w:b/>
-          <w:sz w:val="22"/>
-        </w:rPr>
-        <w:t>}</w:t>
+        <w:t xml:space="preserve">Reference Person: </w:t>
+      </w:r>
+      <w:r>
+        <w:rPr>
+          <w:b/>
+          <w:sz w:val="22"/>
+        </w:rPr>
+        <w:t>{reference_person}</w:t>
       </w:r>
     </w:p>
     <w:p>
@@ -731,23 +539,7 @@
           <w:b/>
           <w:sz w:val="22"/>
         </w:rPr>
-        <w:t>{</w:t>
-      </w:r>
-      <w:proofErr w:type="spellStart"/>
-      <w:r>
-        <w:rPr>
-          <w:b/>
-          <w:sz w:val="22"/>
-        </w:rPr>
-        <w:t>student_name</w:t>
-      </w:r>
-      <w:proofErr w:type="spellEnd"/>
-      <w:r>
-        <w:rPr>
-          <w:b/>
-          <w:sz w:val="22"/>
-        </w:rPr>
-        <w:t>}</w:t>
+        <w:t>{student_name}</w:t>
       </w:r>
     </w:p>
     <w:p>
@@ -790,13 +582,7 @@
         <w:rPr>
           <w:sz w:val="22"/>
         </w:rPr>
-        <w:t xml:space="preserve"> We commend you on your decision to pursue higher education with us and look forward to supporting you on this excit</w:t>
-      </w:r>
-      <w:r>
-        <w:rPr>
-          <w:sz w:val="22"/>
-        </w:rPr>
-        <w:t>ing academic journey.</w:t>
+        <w:t xml:space="preserve"> We commend you on your decision to pursue higher education with us and look forward to supporting you on this exciting academic journey.</w:t>
       </w:r>
     </w:p>
     <w:p>
@@ -837,8 +623,24 @@
         <w:rPr>
           <w:sz w:val="22"/>
         </w:rPr>
-        <w:t>Your admission is for three years</w:t>
-      </w:r>
+        <w:t>Your admission is for</w:t>
+      </w:r>
+      <w:r>
+        <w:rPr>
+          <w:b/>
+          <w:sz w:val="22"/>
+        </w:rPr>
+        <w:t xml:space="preserve"> </w:t>
+      </w:r>
+      <w:r>
+        <w:rPr>
+          <w:b/>
+          <w:sz w:val="22"/>
+        </w:rPr>
+        <w:t>{duration}</w:t>
+      </w:r>
+      <w:bookmarkStart w:id="0" w:name="_GoBack"/>
+      <w:bookmarkEnd w:id="0"/>
       <w:r>
         <w:rPr>
           <w:b/>
@@ -870,13 +672,7 @@
         <w:rPr>
           <w:sz w:val="22"/>
         </w:rPr>
-        <w:t>Additional copies of your academic certifications and testimonials must be submitt</w:t>
-      </w:r>
-      <w:r>
-        <w:rPr>
-          <w:sz w:val="22"/>
-        </w:rPr>
-        <w:t>ed at the time of registration.</w:t>
+        <w:t>Additional copies of your academic certifications and testimonials must be submitted at the time of registration.</w:t>
       </w:r>
     </w:p>
     <w:p>
@@ -960,78 +756,86 @@
       <w:r>
         <w:rPr>
           <w:b/>
+          <w:sz w:val="22"/>
+        </w:rPr>
+        <w:t>+260965669743</w:t>
+      </w:r>
+      <w:r>
+        <w:rPr>
+          <w:b/>
+          <w:sz w:val="22"/>
+        </w:rPr>
+        <w:t>.</w:t>
+      </w:r>
+    </w:p>
+    <w:p>
+      <w:pPr>
+        <w:spacing w:line="276" w:lineRule="auto"/>
+        <w:jc w:val="both"/>
+        <w:rPr>
+          <w:sz w:val="22"/>
+        </w:rPr>
+      </w:pPr>
+      <w:r>
+        <w:rPr>
+          <w:sz w:val="22"/>
+        </w:rPr>
+        <w:t xml:space="preserve">Once again, congratulations on choosing </w:t>
+      </w:r>
+      <w:r>
+        <w:rPr>
+          <w:b/>
           <w:bCs/>
           <w:sz w:val="22"/>
         </w:rPr>
-        <w:t>+260776914683</w:t>
-      </w:r>
-      <w:r>
-        <w:rPr>
-          <w:sz w:val="22"/>
-        </w:rPr>
-        <w:t>.</w:t>
-      </w:r>
-    </w:p>
-    <w:p>
-      <w:pPr>
-        <w:spacing w:before="280" w:after="280" w:line="276" w:lineRule="auto"/>
+        <w:t>DMI-St. Eugene University</w:t>
+      </w:r>
+      <w:r>
+        <w:rPr>
+          <w:sz w:val="22"/>
+        </w:rPr>
+        <w:t>, where academic excellence meets innovation. We are excited to welcome you to our learning community and wish yo</w:t>
+      </w:r>
+      <w:r>
+        <w:rPr>
+          <w:sz w:val="22"/>
+        </w:rPr>
+        <w:t>u great success in your studies.</w:t>
+      </w:r>
+    </w:p>
+    <w:p>
+      <w:pPr>
+        <w:spacing w:line="276" w:lineRule="auto"/>
         <w:jc w:val="both"/>
         <w:rPr>
           <w:sz w:val="22"/>
         </w:rPr>
       </w:pPr>
-      <w:r>
-        <w:rPr>
-          <w:sz w:val="22"/>
-        </w:rPr>
-        <w:t xml:space="preserve">Once again, congratulations on choosing </w:t>
-      </w:r>
-      <w:r>
+    </w:p>
+    <w:p>
+      <w:pPr>
+        <w:spacing w:line="276" w:lineRule="auto"/>
+        <w:jc w:val="both"/>
+        <w:rPr>
+          <w:sz w:val="22"/>
+        </w:rPr>
+      </w:pPr>
+    </w:p>
+    <w:p>
+      <w:pPr>
         <w:rPr>
           <w:b/>
           <w:bCs/>
           <w:sz w:val="22"/>
         </w:rPr>
-        <w:t>DMI-St. Eugene University</w:t>
-      </w:r>
-      <w:r>
-        <w:rPr>
-          <w:sz w:val="22"/>
-        </w:rPr>
-        <w:t>, where academic excellence meets innovation. We are excited to welcome you to our learning community and wish yo</w:t>
-      </w:r>
-      <w:r>
-        <w:rPr>
-          <w:sz w:val="22"/>
-        </w:rPr>
-        <w:t>u great success in your studies.</w:t>
-      </w:r>
-    </w:p>
-    <w:p>
-      <w:pPr>
-        <w:spacing w:before="280" w:after="280" w:line="276" w:lineRule="auto"/>
-        <w:jc w:val="both"/>
-        <w:rPr>
-          <w:sz w:val="22"/>
-        </w:rPr>
-      </w:pPr>
-    </w:p>
-    <w:p>
-      <w:pPr>
-        <w:spacing w:before="280" w:after="280"/>
+      </w:pPr>
+      <w:r>
         <w:rPr>
           <w:b/>
           <w:bCs/>
           <w:sz w:val="22"/>
         </w:rPr>
-      </w:pPr>
-      <w:r>
-        <w:rPr>
-          <w:b/>
-          <w:bCs/>
-          <w:sz w:val="22"/>
-        </w:rPr>
-        <w:t>Deputy Vice Chancellor</w:t>
+        <w:t>Vice Chancellor</w:t>
       </w:r>
       <w:r>
         <w:rPr>
@@ -1051,6 +855,143 @@
           <w:sz w:val="22"/>
         </w:rPr>
         <w:br/>
+      </w:r>
+    </w:p>
+    <w:p>
+      <w:pPr>
+        <w:spacing w:line="259" w:lineRule="auto"/>
+        <w:ind w:left="432"/>
+        <w:jc w:val="center"/>
+        <w:rPr>
+          <w:b/>
+          <w:u w:val="single"/>
+        </w:rPr>
+      </w:pPr>
+      <w:r>
+        <w:rPr>
+          <w:b/>
+          <w:u w:val="single"/>
+        </w:rPr>
+        <w:t>AUTHORISED BANK DETAILS:</w:t>
+      </w:r>
+    </w:p>
+    <w:p>
+      <w:pPr>
+        <w:spacing w:line="259" w:lineRule="auto"/>
+        <w:ind w:left="432"/>
+        <w:rPr>
+          <w:b/>
+        </w:rPr>
+      </w:pPr>
+      <w:r>
+        <w:rPr>
+          <w:b/>
+        </w:rPr>
+        <w:t>Bank Name</w:t>
+      </w:r>
+      <w:r>
+        <w:rPr>
+          <w:b/>
+        </w:rPr>
+        <w:tab/>
+      </w:r>
+      <w:r>
+        <w:rPr>
+          <w:b/>
+        </w:rPr>
+        <w:t xml:space="preserve">: </w:t>
+      </w:r>
+      <w:r>
+        <w:rPr>
+          <w:b/>
+        </w:rPr>
+        <w:tab/>
+      </w:r>
+      <w:r>
+        <w:rPr>
+          <w:b/>
+        </w:rPr>
+        <w:t>INDO ZAMBIA BANK (Main branch)</w:t>
+      </w:r>
+    </w:p>
+    <w:p>
+      <w:pPr>
+        <w:spacing w:line="259" w:lineRule="auto"/>
+        <w:ind w:left="432"/>
+        <w:rPr>
+          <w:b/>
+          <w:bCs/>
+        </w:rPr>
+      </w:pPr>
+      <w:r>
+        <w:rPr>
+          <w:b/>
+          <w:bCs/>
+        </w:rPr>
+        <w:t>A/C</w:t>
+      </w:r>
+      <w:r>
+        <w:rPr>
+          <w:b/>
+          <w:bCs/>
+        </w:rPr>
+        <w:tab/>
+      </w:r>
+      <w:r>
+        <w:rPr>
+          <w:b/>
+          <w:bCs/>
+        </w:rPr>
+        <w:tab/>
+      </w:r>
+      <w:r>
+        <w:rPr>
+          <w:b/>
+          <w:bCs/>
+        </w:rPr>
+        <w:t xml:space="preserve">: </w:t>
+      </w:r>
+      <w:r>
+        <w:rPr>
+          <w:b/>
+          <w:bCs/>
+        </w:rPr>
+        <w:tab/>
+      </w:r>
+      <w:r>
+        <w:rPr>
+          <w:b/>
+          <w:bCs/>
+        </w:rPr>
+        <w:t>0011040002475, A/C NAME: Trust of DMI and Collaborators, SWIFT CODE</w:t>
+      </w:r>
+      <w:r>
+        <w:rPr>
+          <w:b/>
+          <w:bCs/>
+        </w:rPr>
+        <w:tab/>
+      </w:r>
+      <w:r>
+        <w:rPr>
+          <w:b/>
+          <w:bCs/>
+        </w:rPr>
+        <w:t xml:space="preserve">: </w:t>
+      </w:r>
+      <w:r>
+        <w:rPr>
+          <w:b/>
+          <w:bCs/>
+        </w:rPr>
+        <w:tab/>
+      </w:r>
+      <w:r>
+        <w:rPr>
+          <w:b/>
+          <w:bCs/>
+        </w:rPr>
+        <w:t>INZAZMLX</w:t>
       </w:r>
     </w:p>
     <w:sectPr>
@@ -1092,88 +1033,20 @@
     </w:pPr>
     <w:r>
       <w:rPr>
+        <w:noProof/>
         <w:color w:val="000000"/>
+        <w:lang w:val="en-US"/>
       </w:rPr>
       <mc:AlternateContent>
         <mc:Choice Requires="wps">
           <w:drawing>
-            <wp:anchor distT="0" distB="0" distL="114300" distR="114300" simplePos="0" relativeHeight="251666432" behindDoc="0" locked="0" layoutInCell="1" allowOverlap="1" wp14:anchorId="08C69610" wp14:editId="4577A78C">
+            <wp:anchor distT="0" distB="0" distL="114300" distR="114300" simplePos="0" relativeHeight="251665408" behindDoc="0" locked="0" layoutInCell="1" allowOverlap="1" wp14:anchorId="709B1BEB" wp14:editId="098AEEFA">
               <wp:simplePos x="0" y="0"/>
-              <wp:positionH relativeFrom="page">
-                <wp:posOffset>57150</wp:posOffset>
+              <wp:positionH relativeFrom="column">
+                <wp:posOffset>-885825</wp:posOffset>
               </wp:positionH>
               <wp:positionV relativeFrom="paragraph">
-                <wp:posOffset>51434</wp:posOffset>
-              </wp:positionV>
-              <wp:extent cx="7924800" cy="19050"/>
-              <wp:effectExtent l="38100" t="38100" r="76200" b="95250"/>
-              <wp:wrapNone/>
-              <wp:docPr id="11" name="Straight Connector 11"/>
-              <wp:cNvGraphicFramePr/>
-              <a:graphic xmlns:a="http://schemas.openxmlformats.org/drawingml/2006/main">
-                <a:graphicData uri="http://schemas.microsoft.com/office/word/2010/wordprocessingShape">
-                  <wps:wsp>
-                    <wps:cNvCnPr/>
-                    <wps:spPr>
-                      <a:xfrm flipV="1">
-                        <a:off x="0" y="0"/>
-                        <a:ext cx="7924800" cy="19050"/>
-                      </a:xfrm>
-                      <a:prstGeom prst="line">
-                        <a:avLst/>
-                      </a:prstGeom>
-                    </wps:spPr>
-                    <wps:style>
-                      <a:lnRef idx="2">
-                        <a:schemeClr val="accent6"/>
-                      </a:lnRef>
-                      <a:fillRef idx="0">
-                        <a:schemeClr val="accent6"/>
-                      </a:fillRef>
-                      <a:effectRef idx="1">
-                        <a:schemeClr val="accent6"/>
-                      </a:effectRef>
-                      <a:fontRef idx="minor">
-                        <a:schemeClr val="tx1"/>
-                      </a:fontRef>
-                    </wps:style>
-                    <wps:bodyPr/>
-                  </wps:wsp>
-                </a:graphicData>
-              </a:graphic>
-              <wp14:sizeRelH relativeFrom="margin">
-                <wp14:pctWidth>0</wp14:pctWidth>
-              </wp14:sizeRelH>
-              <wp14:sizeRelV relativeFrom="margin">
-                <wp14:pctHeight>0</wp14:pctHeight>
-              </wp14:sizeRelV>
-            </wp:anchor>
-          </w:drawing>
-        </mc:Choice>
-        <mc:Fallback>
-          <w:pict>
-            <v:line w14:anchorId="6325E245" id="Straight Connector 11" o:spid="_x0000_s1026" style="position:absolute;flip:y;z-index:251666432;visibility:visible;mso-wrap-style:square;mso-width-percent:0;mso-height-percent:0;mso-wrap-distance-left:9pt;mso-wrap-distance-top:0;mso-wrap-distance-right:9pt;mso-wrap-distance-bottom:0;mso-position-horizontal:absolute;mso-position-horizontal-relative:page;mso-position-vertical:absolute;mso-position-vertical-relative:text;mso-width-percent:0;mso-height-percent:0;mso-width-relative:margin;mso-height-relative:margin" from="4.5pt,4.05pt" to="628.5pt,5.55pt" o:gfxdata="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" strokecolor="#f79646 [3209]" strokeweight="2pt">
-              <v:shadow on="t" color="black" opacity="24903f" origin=",.5" offset="0,.55556mm"/>
-              <w10:wrap anchorx="page"/>
-            </v:line>
-          </w:pict>
-        </mc:Fallback>
-      </mc:AlternateContent>
-    </w:r>
-    <w:r>
-      <w:rPr>
-        <w:color w:val="000000"/>
-      </w:rPr>
-      <mc:AlternateContent>
-        <mc:Choice Requires="wps">
-          <w:drawing>
-            <wp:anchor distT="0" distB="0" distL="114300" distR="114300" simplePos="0" relativeHeight="251665408" behindDoc="0" locked="0" layoutInCell="1" allowOverlap="1" wp14:anchorId="57780527" wp14:editId="326A7D3D">
-              <wp:simplePos x="0" y="0"/>
-              <wp:positionH relativeFrom="column">
-                <wp:posOffset>-847725</wp:posOffset>
-              </wp:positionH>
-              <wp:positionV relativeFrom="paragraph">
-                <wp:posOffset>-15240</wp:posOffset>
+                <wp:posOffset>32385</wp:posOffset>
               </wp:positionV>
               <wp:extent cx="7791450" cy="19050"/>
               <wp:effectExtent l="57150" t="38100" r="76200" b="95250"/>
@@ -1227,8 +1100,80 @@
         </mc:Choice>
         <mc:Fallback>
           <w:pict>
-            <v:line w14:anchorId="1136F6A3" id="Straight Connector 10" o:spid="_x0000_s1026" style="position:absolute;flip:y;z-index:251665408;visibility:visible;mso-wrap-style:square;mso-width-percent:0;mso-height-percent:0;mso-wrap-distance-left:9pt;mso-wrap-distance-top:0;mso-wrap-distance-right:9pt;mso-wrap-distance-bottom:0;mso-position-horizontal:absolute;mso-position-horizontal-relative:text;mso-position-vertical:absolute;mso-position-vertical-relative:text;mso-width-percent:0;mso-height-percent:0;mso-width-relative:margin;mso-height-relative:margin" from="-66.75pt,-1.2pt" to="546.75pt,.3pt" o:gfxdata="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" strokecolor="#00b050" strokeweight="3pt">
+            <v:line w14:anchorId="3FD200C3" id="Straight Connector 10" o:spid="_x0000_s1026" style="position:absolute;flip:y;z-index:251665408;visibility:visible;mso-wrap-style:square;mso-width-percent:0;mso-height-percent:0;mso-wrap-distance-left:9pt;mso-wrap-distance-top:0;mso-wrap-distance-right:9pt;mso-wrap-distance-bottom:0;mso-position-horizontal:absolute;mso-position-horizontal-relative:text;mso-position-vertical:absolute;mso-position-vertical-relative:text;mso-width-percent:0;mso-height-percent:0;mso-width-relative:margin;mso-height-relative:margin" from="-69.75pt,2.55pt" to="543.75pt,4.05pt" o:gfxdata="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" strokecolor="#00b050" strokeweight="3pt">
               <v:shadow on="t" color="black" opacity="22937f" origin=",.5" offset="0,.63889mm"/>
+            </v:line>
+          </w:pict>
+        </mc:Fallback>
+      </mc:AlternateContent>
+    </w:r>
+    <w:r>
+      <w:rPr>
+        <w:noProof/>
+        <w:color w:val="000000"/>
+        <w:lang w:val="en-US"/>
+      </w:rPr>
+      <mc:AlternateContent>
+        <mc:Choice Requires="wps">
+          <w:drawing>
+            <wp:anchor distT="0" distB="0" distL="114300" distR="114300" simplePos="0" relativeHeight="251666432" behindDoc="0" locked="0" layoutInCell="1" allowOverlap="1" wp14:anchorId="46532E1C" wp14:editId="001CD054">
+              <wp:simplePos x="0" y="0"/>
+              <wp:positionH relativeFrom="page">
+                <wp:posOffset>-38100</wp:posOffset>
+              </wp:positionH>
+              <wp:positionV relativeFrom="paragraph">
+                <wp:posOffset>-835025</wp:posOffset>
+              </wp:positionV>
+              <wp:extent cx="7924800" cy="19050"/>
+              <wp:effectExtent l="38100" t="38100" r="76200" b="95250"/>
+              <wp:wrapNone/>
+              <wp:docPr id="11" name="Straight Connector 11"/>
+              <wp:cNvGraphicFramePr/>
+              <a:graphic xmlns:a="http://schemas.openxmlformats.org/drawingml/2006/main">
+                <a:graphicData uri="http://schemas.microsoft.com/office/word/2010/wordprocessingShape">
+                  <wps:wsp>
+                    <wps:cNvCnPr/>
+                    <wps:spPr>
+                      <a:xfrm flipV="1">
+                        <a:off x="0" y="0"/>
+                        <a:ext cx="7924800" cy="19050"/>
+                      </a:xfrm>
+                      <a:prstGeom prst="line">
+                        <a:avLst/>
+                      </a:prstGeom>
+                    </wps:spPr>
+                    <wps:style>
+                      <a:lnRef idx="2">
+                        <a:schemeClr val="accent6"/>
+                      </a:lnRef>
+                      <a:fillRef idx="0">
+                        <a:schemeClr val="accent6"/>
+                      </a:fillRef>
+                      <a:effectRef idx="1">
+                        <a:schemeClr val="accent6"/>
+                      </a:effectRef>
+                      <a:fontRef idx="minor">
+                        <a:schemeClr val="tx1"/>
+                      </a:fontRef>
+                    </wps:style>
+                    <wps:bodyPr/>
+                  </wps:wsp>
+                </a:graphicData>
+              </a:graphic>
+              <wp14:sizeRelH relativeFrom="margin">
+                <wp14:pctWidth>0</wp14:pctWidth>
+              </wp14:sizeRelH>
+              <wp14:sizeRelV relativeFrom="margin">
+                <wp14:pctHeight>0</wp14:pctHeight>
+              </wp14:sizeRelV>
+            </wp:anchor>
+          </w:drawing>
+        </mc:Choice>
+        <mc:Fallback>
+          <w:pict>
+            <v:line w14:anchorId="356D21F7" id="Straight Connector 11" o:spid="_x0000_s1026" style="position:absolute;flip:y;z-index:251666432;visibility:visible;mso-wrap-style:square;mso-width-percent:0;mso-height-percent:0;mso-wrap-distance-left:9pt;mso-wrap-distance-top:0;mso-wrap-distance-right:9pt;mso-wrap-distance-bottom:0;mso-position-horizontal:absolute;mso-position-horizontal-relative:page;mso-position-vertical:absolute;mso-position-vertical-relative:text;mso-width-percent:0;mso-height-percent:0;mso-width-relative:margin;mso-height-relative:margin" from="-3pt,-65.75pt" to="621pt,-64.25pt" o:gfxdata="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" strokecolor="#f79646 [3209]" strokeweight="2pt">
+              <v:shadow on="t" color="black" opacity="24903f" origin=",.5" offset="0,.55556mm"/>
+              <w10:wrap anchorx="page"/>
             </v:line>
           </w:pict>
         </mc:Fallback>
@@ -1394,7 +1339,6 @@
                           <w:pPr>
                             <w:textDirection w:val="btLr"/>
                           </w:pPr>
-                          <w:proofErr w:type="spellStart"/>
                           <w:r>
                             <w:rPr>
                               <w:rFonts w:ascii="CG Omega" w:eastAsia="CG Omega" w:hAnsi="CG Omega" w:cs="CG Omega"/>
@@ -1402,37 +1346,7 @@
                               <w:color w:val="000000"/>
                               <w:sz w:val="16"/>
                             </w:rPr>
-                            <w:t>Ph</w:t>
-                          </w:r>
-                          <w:proofErr w:type="spellEnd"/>
-                          <w:r>
-                            <w:rPr>
-                              <w:rFonts w:ascii="CG Omega" w:eastAsia="CG Omega" w:hAnsi="CG Omega" w:cs="CG Omega"/>
-                              <w:b/>
-                              <w:color w:val="000000"/>
-                              <w:sz w:val="16"/>
-                            </w:rPr>
-                            <w:t xml:space="preserve">: +260 977 613 </w:t>
-                          </w:r>
-                          <w:proofErr w:type="gramStart"/>
-                          <w:r>
-                            <w:rPr>
-                              <w:rFonts w:ascii="CG Omega" w:eastAsia="CG Omega" w:hAnsi="CG Omega" w:cs="CG Omega"/>
-                              <w:b/>
-                              <w:color w:val="000000"/>
-                              <w:sz w:val="16"/>
-                            </w:rPr>
-                            <w:t>644;+</w:t>
-                          </w:r>
-                          <w:proofErr w:type="gramEnd"/>
-                          <w:r>
-                            <w:rPr>
-                              <w:rFonts w:ascii="CG Omega" w:eastAsia="CG Omega" w:hAnsi="CG Omega" w:cs="CG Omega"/>
-                              <w:b/>
-                              <w:color w:val="000000"/>
-                              <w:sz w:val="16"/>
-                            </w:rPr>
-                            <w:t>260 950167850</w:t>
+                            <w:t>Ph: +260 977 613 644;+260 950167850</w:t>
                           </w:r>
                         </w:p>
                         <w:p>
@@ -1488,7 +1402,6 @@
                     <w:pPr>
                       <w:textDirection w:val="btLr"/>
                     </w:pPr>
-                    <w:proofErr w:type="spellStart"/>
                     <w:r>
                       <w:rPr>
                         <w:rFonts w:ascii="CG Omega" w:eastAsia="CG Omega" w:hAnsi="CG Omega" w:cs="CG Omega"/>
@@ -1496,37 +1409,7 @@
                         <w:color w:val="000000"/>
                         <w:sz w:val="16"/>
                       </w:rPr>
-                      <w:t>Ph</w:t>
-                    </w:r>
-                    <w:proofErr w:type="spellEnd"/>
-                    <w:r>
-                      <w:rPr>
-                        <w:rFonts w:ascii="CG Omega" w:eastAsia="CG Omega" w:hAnsi="CG Omega" w:cs="CG Omega"/>
-                        <w:b/>
-                        <w:color w:val="000000"/>
-                        <w:sz w:val="16"/>
-                      </w:rPr>
-                      <w:t xml:space="preserve">: +260 977 613 </w:t>
-                    </w:r>
-                    <w:proofErr w:type="gramStart"/>
-                    <w:r>
-                      <w:rPr>
-                        <w:rFonts w:ascii="CG Omega" w:eastAsia="CG Omega" w:hAnsi="CG Omega" w:cs="CG Omega"/>
-                        <w:b/>
-                        <w:color w:val="000000"/>
-                        <w:sz w:val="16"/>
-                      </w:rPr>
-                      <w:t>644;+</w:t>
-                    </w:r>
-                    <w:proofErr w:type="gramEnd"/>
-                    <w:r>
-                      <w:rPr>
-                        <w:rFonts w:ascii="CG Omega" w:eastAsia="CG Omega" w:hAnsi="CG Omega" w:cs="CG Omega"/>
-                        <w:b/>
-                        <w:color w:val="000000"/>
-                        <w:sz w:val="16"/>
-                      </w:rPr>
-                      <w:t>260 950167850</w:t>
+                      <w:t>Ph: +260 977 613 644;+260 950167850</w:t>
                     </w:r>
                   </w:p>
                   <w:p>
@@ -1793,7 +1676,6 @@
                             <w:jc w:val="right"/>
                             <w:textDirection w:val="btLr"/>
                           </w:pPr>
-                          <w:proofErr w:type="spellStart"/>
                           <w:r>
                             <w:rPr>
                               <w:rFonts w:ascii="CG Omega" w:eastAsia="CG Omega" w:hAnsi="CG Omega" w:cs="CG Omega"/>
@@ -1801,28 +1683,7 @@
                               <w:color w:val="000000"/>
                               <w:sz w:val="16"/>
                             </w:rPr>
-                            <w:t>P.</w:t>
-                          </w:r>
-                          <w:proofErr w:type="gramStart"/>
-                          <w:r>
-                            <w:rPr>
-                              <w:rFonts w:ascii="CG Omega" w:eastAsia="CG Omega" w:hAnsi="CG Omega" w:cs="CG Omega"/>
-                              <w:b/>
-                              <w:color w:val="000000"/>
-                              <w:sz w:val="16"/>
-                            </w:rPr>
-                            <w:t>O.Box</w:t>
-                          </w:r>
-                          <w:proofErr w:type="spellEnd"/>
-                          <w:proofErr w:type="gramEnd"/>
-                          <w:r>
-                            <w:rPr>
-                              <w:rFonts w:ascii="CG Omega" w:eastAsia="CG Omega" w:hAnsi="CG Omega" w:cs="CG Omega"/>
-                              <w:b/>
-                              <w:color w:val="000000"/>
-                              <w:sz w:val="16"/>
-                            </w:rPr>
-                            <w:t>. 330081</w:t>
+                            <w:t>P.O.Box. 330081</w:t>
                           </w:r>
                         </w:p>
                         <w:p>
@@ -1830,8 +1691,6 @@
                             <w:jc w:val="right"/>
                             <w:textDirection w:val="btLr"/>
                           </w:pPr>
-                          <w:proofErr w:type="spellStart"/>
-                          <w:proofErr w:type="gramStart"/>
                           <w:r>
                             <w:rPr>
                               <w:rFonts w:ascii="CG Omega" w:eastAsia="CG Omega" w:hAnsi="CG Omega" w:cs="CG Omega"/>
@@ -1841,8 +1700,6 @@
                             </w:rPr>
                             <w:t>Lusaka,Zambia</w:t>
                           </w:r>
-                          <w:proofErr w:type="spellEnd"/>
-                          <w:proofErr w:type="gramEnd"/>
                         </w:p>
                         <w:p>
                           <w:pPr>
@@ -1885,7 +1742,6 @@
                       <w:jc w:val="right"/>
                       <w:textDirection w:val="btLr"/>
                     </w:pPr>
-                    <w:proofErr w:type="spellStart"/>
                     <w:r>
                       <w:rPr>
                         <w:rFonts w:ascii="CG Omega" w:eastAsia="CG Omega" w:hAnsi="CG Omega" w:cs="CG Omega"/>
@@ -1893,28 +1749,7 @@
                         <w:color w:val="000000"/>
                         <w:sz w:val="16"/>
                       </w:rPr>
-                      <w:t>P.</w:t>
-                    </w:r>
-                    <w:proofErr w:type="gramStart"/>
-                    <w:r>
-                      <w:rPr>
-                        <w:rFonts w:ascii="CG Omega" w:eastAsia="CG Omega" w:hAnsi="CG Omega" w:cs="CG Omega"/>
-                        <w:b/>
-                        <w:color w:val="000000"/>
-                        <w:sz w:val="16"/>
-                      </w:rPr>
-                      <w:t>O.Box</w:t>
-                    </w:r>
-                    <w:proofErr w:type="spellEnd"/>
-                    <w:proofErr w:type="gramEnd"/>
-                    <w:r>
-                      <w:rPr>
-                        <w:rFonts w:ascii="CG Omega" w:eastAsia="CG Omega" w:hAnsi="CG Omega" w:cs="CG Omega"/>
-                        <w:b/>
-                        <w:color w:val="000000"/>
-                        <w:sz w:val="16"/>
-                      </w:rPr>
-                      <w:t>. 330081</w:t>
+                      <w:t>P.O.Box. 330081</w:t>
                     </w:r>
                   </w:p>
                   <w:p>
@@ -1922,8 +1757,6 @@
                       <w:jc w:val="right"/>
                       <w:textDirection w:val="btLr"/>
                     </w:pPr>
-                    <w:proofErr w:type="spellStart"/>
-                    <w:proofErr w:type="gramStart"/>
                     <w:r>
                       <w:rPr>
                         <w:rFonts w:ascii="CG Omega" w:eastAsia="CG Omega" w:hAnsi="CG Omega" w:cs="CG Omega"/>
@@ -1933,8 +1766,6 @@
                       </w:rPr>
                       <w:t>Lusaka,Zambia</w:t>
                     </w:r>
-                    <w:proofErr w:type="spellEnd"/>
-                    <w:proofErr w:type="gramEnd"/>
                   </w:p>
                   <w:p>
                     <w:pPr>
@@ -2130,7 +1961,7 @@
     <w:lsdException w:name="Closing" w:semiHidden="1" w:unhideWhenUsed="1"/>
     <w:lsdException w:name="Signature" w:semiHidden="1" w:unhideWhenUsed="1"/>
     <w:lsdException w:name="Default Paragraph Font" w:semiHidden="1" w:uiPriority="1" w:unhideWhenUsed="1"/>
-    <w:lsdException w:name="Body Text" w:semiHidden="1" w:unhideWhenUsed="1"/>
+    <w:lsdException w:name="Body Text" w:semiHidden="1" w:uiPriority="0" w:unhideWhenUsed="1"/>
     <w:lsdException w:name="Body Text Indent" w:semiHidden="1" w:unhideWhenUsed="1"/>
     <w:lsdException w:name="List Continue" w:semiHidden="1" w:unhideWhenUsed="1"/>
     <w:lsdException w:name="List Continue 2" w:semiHidden="1" w:unhideWhenUsed="1"/>
@@ -2654,6 +2485,27 @@
     <w:uiPriority w:val="99"/>
     <w:rsid w:val="00020BE7"/>
   </w:style>
+  <w:style w:type="paragraph" w:styleId="BodyText">
+    <w:name w:val="Body Text"/>
+    <w:basedOn w:val="Normal"/>
+    <w:link w:val="BodyTextChar"/>
+    <w:rsid w:val="00DB339E"/>
+    <w:pPr>
+      <w:spacing w:after="120"/>
+    </w:pPr>
+    <w:rPr>
+      <w:lang w:val="en-US"/>
+    </w:rPr>
+  </w:style>
+  <w:style w:type="character" w:customStyle="1" w:styleId="BodyTextChar">
+    <w:name w:val="Body Text Char"/>
+    <w:basedOn w:val="DefaultParagraphFont"/>
+    <w:link w:val="BodyText"/>
+    <w:rsid w:val="00DB339E"/>
+    <w:rPr>
+      <w:lang w:val="en-US"/>
+    </w:rPr>
+  </w:style>
 </w:styles>
 </file>
 

</xml_diff>